<commit_message>
fix(reports): alinha saida do worker compound ao padrao do relatorio finalizado
Comparacao com um relatorio finalizado (LT 750 kV Itabera - Tijuco Preto II)
revelou divergencias entre o que o worker gera e o que o time acabou
entregando a mao: typo "Atitude" no cadastro de erosao, titulos de secao
diferentes, ausencia da linha de local/data na assinatura e Sumario com
paginas em cache. Corrige tudo isso e adiciona a Tabela 1 (Grau de
Criticidade) como conteudo opcional no wizard, espelhando o toggle ja
existente de coordenadas de torre.

Co-Authored-By: Claude <noreply@anthropic.com>
</commit_message>
<xml_diff>
--- a/worker/assets/template_ficha_cadastro_erosao.docx
+++ b/worker/assets/template_ficha_cadastro_erosao.docx
@@ -328,10 +328,10 @@
             </w:pPr>
             <w:r>
               <w:rPr>
-                <w:rFonts w:ascii="Arial" w:eastAsia="Arial" w:hAnsi="Arial" w:cs="Arial"/>
-                <w:sz w:val="18"/>
-              </w:rPr>
-              <w:t xml:space="preserve">Atitude: </w:t>
+                <w:rFonts w:ascii="DM Sans" w:eastAsia="Arial" w:hAnsi="DM Sans" w:cs="Arial"/>
+                <w:sz w:val="18"/>
+              </w:rPr>
+              <w:t xml:space="preserve">Altitude: </w:t>
             </w:r>
           </w:p>
         </w:tc>
@@ -394,7 +394,7 @@
             </w:pPr>
             <w:r>
               <w:rPr>
-                <w:rFonts w:ascii="Arial" w:eastAsia="Arial" w:hAnsi="Arial" w:cs="Arial"/>
+                <w:rFonts w:ascii="DM Sans" w:eastAsia="Arial" w:hAnsi="DM Sans" w:cs="Arial"/>
                 <w:sz w:val="18"/>
               </w:rPr>
               <w:t xml:space="preserve">Fotos: </w:t>
@@ -526,7 +526,7 @@
             </w:pPr>
             <w:r>
               <w:rPr>
-                <w:rFonts w:ascii="Arial" w:eastAsia="Arial" w:hAnsi="Arial" w:cs="Arial"/>
+                <w:rFonts w:ascii="DM Sans" w:eastAsia="Arial" w:hAnsi="DM Sans" w:cs="Arial"/>
                 <w:sz w:val="18"/>
                 <w:highlight w:val="lightGray"/>
               </w:rPr>
@@ -2956,7 +2956,7 @@
             </w:pPr>
             <w:r>
               <w:rPr>
-                <w:rFonts w:ascii="Arial" w:eastAsia="Arial" w:hAnsi="Arial" w:cs="Arial"/>
+                <w:rFonts w:ascii="DM Sans" w:eastAsia="Arial" w:hAnsi="DM Sans" w:cs="Arial"/>
                 <w:sz w:val="18"/>
               </w:rPr>
               <w:t xml:space="preserve"> </w:t>

</xml_diff>